<commit_message>
fix(rab): update NIP Heria Suwandi to 197101272006041009 in SPT and BAST export controller and templates
</commit_message>
<xml_diff>
--- a/public/assets/Berita_Acara_Serah_Terima.docx
+++ b/public/assets/Berita_Acara_Serah_Terima.docx
@@ -211,7 +211,7 @@
       </w:r>
       <w:r>
         <w:tab/>
-        <w:t>: [NIP]</w:t>
+        <w:t>: 197101272006041009</w:t>
       </w:r>
       <w:r>
         <w:br/>
@@ -1045,7 +1045,7 @@
               <w:t xml:space="preserve">                     </w:t>
             </w:r>
             <w:r>
-              <w:t>NIP [NIP]</w:t>
+              <w:t>NIP 197101272006041009</w:t>
             </w:r>
           </w:p>
         </w:tc>

</xml_diff>

<commit_message>
fix(docx): center align signature blocks to prevent NIP numbers from wrapping to new line
</commit_message>
<xml_diff>
--- a/public/assets/Berita_Acara_Serah_Terima.docx
+++ b/public/assets/Berita_Acara_Serah_Terima.docx
@@ -887,9 +887,9 @@
             <w:hideMark/>
           </w:tcPr>
           <w:p>
-            <w:r>
-              <w:t xml:space="preserve">                 </w:t>
-            </w:r>
+            <w:pPr>
+              <w:jc w:val="center"/>
+            </w:pPr>
             <w:r>
               <w:t>PIHAK KESATU</w:t>
             </w:r>
@@ -936,19 +936,6 @@
               <w:rPr>
                 <w:b/>
               </w:rPr>
-              <w:t xml:space="preserve">                     </w:t>
-            </w:r>
-            <w:proofErr w:type="gramStart"/>
-            <w:r>
-              <w:rPr>
-                <w:b/>
-              </w:rPr>
-              <w:t xml:space="preserve">   </w:t>
-            </w:r>
-            <w:r>
-              <w:rPr>
-                <w:b/>
-              </w:rPr>
               <w:t>[</w:t>
             </w:r>
             <w:proofErr w:type="gramEnd"/>
@@ -965,9 +952,6 @@
               <w:br/>
             </w:r>
             <w:r>
-              <w:t xml:space="preserve">             </w:t>
-            </w:r>
-            <w:r>
               <w:t>NIP [NIP]</w:t>
             </w:r>
           </w:p>
@@ -978,17 +962,14 @@
             <w:hideMark/>
           </w:tcPr>
           <w:p>
-            <w:r>
-              <w:t xml:space="preserve">                          </w:t>
-            </w:r>
+            <w:pPr>
+              <w:jc w:val="center"/>
+            </w:pPr>
             <w:r>
               <w:t>PIHAK KEDUA</w:t>
             </w:r>
             <w:r>
               <w:br/>
-            </w:r>
-            <w:r>
-              <w:t xml:space="preserve">                </w:t>
             </w:r>
             <w:proofErr w:type="spellStart"/>
             <w:r>
@@ -1027,12 +1008,6 @@
               <w:rPr>
                 <w:b/>
               </w:rPr>
-              <w:t xml:space="preserve">                         </w:t>
-            </w:r>
-            <w:r>
-              <w:rPr>
-                <w:b/>
-              </w:rPr>
               <w:t>Heria Suwandi</w:t>
             </w:r>
             <w:r>
@@ -1040,9 +1015,6 @@
                 <w:b/>
               </w:rPr>
               <w:br/>
-            </w:r>
-            <w:r>
-              <w:t xml:space="preserve">                     </w:t>
             </w:r>
             <w:r>
               <w:t>NIP 197101272006041009</w:t>

</xml_diff>